<commit_message>
Document GUI runs and verify action buttons
</commit_message>
<xml_diff>
--- a/manuales/Manual_de_Usuario_SLAMCart3D.docx
+++ b/manuales/Manual_de_Usuario_SLAMCart3D.docx
@@ -1351,6 +1351,112 @@
       </w:r>
     </w:p>
     <w:p>
+      <w:pPr>
+        <w:keepNext/>
+        <w:jc w:val="center"/>
+      </w:pPr>
+      <w:r>
+        <w:drawing>
+          <wp:inline xmlns:a="http://schemas.openxmlformats.org/drawingml/2006/main" xmlns:pic="http://schemas.openxmlformats.org/drawingml/2006/picture">
+            <wp:extent cx="5943600" cy="3820886"/>
+            <wp:docPr id="2" name="Picture 2"/>
+            <wp:cNvGraphicFramePr>
+              <a:graphicFrameLocks noChangeAspect="1"/>
+            </wp:cNvGraphicFramePr>
+            <a:graphic>
+              <a:graphicData uri="http://schemas.openxmlformats.org/drawingml/2006/picture">
+                <pic:pic>
+                  <pic:nvPicPr>
+                    <pic:cNvPr id="0" name="gui_scene.png"/>
+                    <pic:cNvPicPr/>
+                  </pic:nvPicPr>
+                  <pic:blipFill>
+                    <a:blip r:embed="rId10"/>
+                    <a:stretch>
+                      <a:fillRect/>
+                    </a:stretch>
+                  </pic:blipFill>
+                  <pic:spPr>
+                    <a:xfrm>
+                      <a:off x="0" y="0"/>
+                      <a:ext cx="5943600" cy="3820886"/>
+                    </a:xfrm>
+                    <a:prstGeom prst="rect"/>
+                  </pic:spPr>
+                </pic:pic>
+              </a:graphicData>
+            </a:graphic>
+          </wp:inline>
+        </w:drawing>
+      </w:r>
+    </w:p>
+    <w:p>
+      <w:pPr>
+        <w:spacing w:after="240"/>
+        <w:jc w:val="center"/>
+      </w:pPr>
+      <w:r>
+        <w:rPr>
+          <w:i/>
+          <w:sz w:val="18"/>
+        </w:rPr>
+        <w:t>Figura 2. Pestaña Trayectoria y mapa después de pulsar Ejecutar experimento. Las rutas verdadera y estimada casi coinciden en esta corrida; los puntos azules son retornos LiDAR colocados con la pose estimada.</w:t>
+      </w:r>
+    </w:p>
+    <w:p>
+      <w:pPr>
+        <w:keepNext/>
+        <w:jc w:val="center"/>
+      </w:pPr>
+      <w:r>
+        <w:drawing>
+          <wp:inline xmlns:a="http://schemas.openxmlformats.org/drawingml/2006/main" xmlns:pic="http://schemas.openxmlformats.org/drawingml/2006/picture">
+            <wp:extent cx="5943600" cy="3820886"/>
+            <wp:docPr id="3" name="Picture 3"/>
+            <wp:cNvGraphicFramePr>
+              <a:graphicFrameLocks noChangeAspect="1"/>
+            </wp:cNvGraphicFramePr>
+            <a:graphic>
+              <a:graphicData uri="http://schemas.openxmlformats.org/drawingml/2006/picture">
+                <pic:pic>
+                  <pic:nvPicPr>
+                    <pic:cNvPr id="0" name="gui_metrics.png"/>
+                    <pic:cNvPicPr/>
+                  </pic:nvPicPr>
+                  <pic:blipFill>
+                    <a:blip r:embed="rId11"/>
+                    <a:stretch>
+                      <a:fillRect/>
+                    </a:stretch>
+                  </pic:blipFill>
+                  <pic:spPr>
+                    <a:xfrm>
+                      <a:off x="0" y="0"/>
+                      <a:ext cx="5943600" cy="3820886"/>
+                    </a:xfrm>
+                    <a:prstGeom prst="rect"/>
+                  </pic:spPr>
+                </pic:pic>
+              </a:graphicData>
+            </a:graphic>
+          </wp:inline>
+        </w:drawing>
+      </w:r>
+    </w:p>
+    <w:p>
+      <w:pPr>
+        <w:spacing w:after="240"/>
+        <w:jc w:val="center"/>
+      </w:pPr>
+      <w:r>
+        <w:rPr>
+          <w:i/>
+          <w:sz w:val="18"/>
+        </w:rPr>
+        <w:t>Figura 3. Pestaña Métricas de la misma ejecución. Cada fila muestra una magnitud y su unidad; el tiempo de cómputo depende del equipo y no debe interpretarse como medida de precisión.</w:t>
+      </w:r>
+    </w:p>
+    <w:p>
       <w:r>
         <w:t>ATE RMSE y RPE traslacional se expresan en metros; valores menores indican menor error. La disponibilidad mide poses finitas y no demuestra que el seguimiento sea preciso. El F1 del mapa combina precisión y cobertura de paredes; áreas no observadas pueden reducir el recall. El contador de contacto con paredes revisa la trayectoria central muestreada, sin radio del chasis.</w:t>
       </w:r>
@@ -1825,12 +1931,12 @@
         <w:pStyle w:val="Heading1"/>
       </w:pPr>
       <w:r>
-        <w:t>5 Ejemplo reproducible con gráficas tridimensionales</w:t>
+        <w:t>5 Ejemplo reproducible con vista tridimensional</w:t>
       </w:r>
     </w:p>
     <w:p>
       <w:r>
-        <w:t>Las figuras 2 y 3 se generaron desde los datos exportados por una corrida real del ejemplo configs/example_multilayer_lidar.yaml con semilla 42 y algoritmo dead_reckoning. No son capturas de una interfaz vacía. El comando reproducible es:</w:t>
+        <w:t>Las figuras 4 y 5 son capturas de la pestaña Nube 3D durante una ejecución real de configs/example_multilayer_lidar.yaml con semilla 42 y odometría de ruedas. Se pulsó Ejecutar experimento y después se giró la vista arrastrando con el ratón. La tabla recoge una corrida de referencia con la misma configuración. Cada ejecución recibe un identificador nuevo; las métricas, salvo el tiempo de cómputo, coincidieron con las de las capturas. También puede reproducirla desde la consola:</w:t>
       </w:r>
     </w:p>
     <w:p>
@@ -1844,6 +1950,112 @@
           <w:sz w:val="18"/>
         </w:rPr>
         <w:t>slamcart3d run configs/example_multilayer_lidar.yaml --plot</w:t>
+      </w:r>
+    </w:p>
+    <w:p>
+      <w:pPr>
+        <w:keepNext/>
+        <w:jc w:val="center"/>
+      </w:pPr>
+      <w:r>
+        <w:drawing>
+          <wp:inline xmlns:a="http://schemas.openxmlformats.org/drawingml/2006/main" xmlns:pic="http://schemas.openxmlformats.org/drawingml/2006/picture">
+            <wp:extent cx="5943600" cy="3820886"/>
+            <wp:docPr id="4" name="Picture 4"/>
+            <wp:cNvGraphicFramePr>
+              <a:graphicFrameLocks noChangeAspect="1"/>
+            </wp:cNvGraphicFramePr>
+            <a:graphic>
+              <a:graphicData uri="http://schemas.openxmlformats.org/drawingml/2006/picture">
+                <pic:pic>
+                  <pic:nvPicPr>
+                    <pic:cNvPr id="0" name="gui_cloud3d.png"/>
+                    <pic:cNvPicPr/>
+                  </pic:nvPicPr>
+                  <pic:blipFill>
+                    <a:blip r:embed="rId12"/>
+                    <a:stretch>
+                      <a:fillRect/>
+                    </a:stretch>
+                  </pic:blipFill>
+                  <pic:spPr>
+                    <a:xfrm>
+                      <a:off x="0" y="0"/>
+                      <a:ext cx="5943600" cy="3820886"/>
+                    </a:xfrm>
+                    <a:prstGeom prst="rect"/>
+                  </pic:spPr>
+                </pic:pic>
+              </a:graphicData>
+            </a:graphic>
+          </wp:inline>
+        </w:drawing>
+      </w:r>
+    </w:p>
+    <w:p>
+      <w:pPr>
+        <w:spacing w:after="240"/>
+        <w:jc w:val="center"/>
+      </w:pPr>
+      <w:r>
+        <w:rPr>
+          <w:i/>
+          <w:sz w:val="18"/>
+        </w:rPr>
+        <w:t>Figura 4. Pestaña Nube 3D de SLAMCart3D con 6 550 puntos de la corrida repetida. Las paredes aparecen en líneas grises, la nube en azul y las trayectorias en el suelo.</w:t>
+      </w:r>
+    </w:p>
+    <w:p>
+      <w:pPr>
+        <w:keepNext/>
+        <w:jc w:val="center"/>
+      </w:pPr>
+      <w:r>
+        <w:drawing>
+          <wp:inline xmlns:a="http://schemas.openxmlformats.org/drawingml/2006/main" xmlns:pic="http://schemas.openxmlformats.org/drawingml/2006/picture">
+            <wp:extent cx="5943600" cy="3290363"/>
+            <wp:docPr id="5" name="Picture 5"/>
+            <wp:cNvGraphicFramePr>
+              <a:graphicFrameLocks noChangeAspect="1"/>
+            </wp:cNvGraphicFramePr>
+            <a:graphic>
+              <a:graphicData uri="http://schemas.openxmlformats.org/drawingml/2006/picture">
+                <pic:pic>
+                  <pic:nvPicPr>
+                    <pic:cNvPr id="0" name="gui_cloud3d_rotated_view.png"/>
+                    <pic:cNvPicPr/>
+                  </pic:nvPicPr>
+                  <pic:blipFill>
+                    <a:blip r:embed="rId13"/>
+                    <a:stretch>
+                      <a:fillRect/>
+                    </a:stretch>
+                  </pic:blipFill>
+                  <pic:spPr>
+                    <a:xfrm>
+                      <a:off x="0" y="0"/>
+                      <a:ext cx="5943600" cy="3290363"/>
+                    </a:xfrm>
+                    <a:prstGeom prst="rect"/>
+                  </pic:spPr>
+                </pic:pic>
+              </a:graphicData>
+            </a:graphic>
+          </wp:inline>
+        </w:drawing>
+      </w:r>
+    </w:p>
+    <w:p>
+      <w:pPr>
+        <w:spacing w:after="240"/>
+        <w:jc w:val="center"/>
+      </w:pPr>
+      <w:r>
+        <w:rPr>
+          <w:i/>
+          <w:sz w:val="18"/>
+        </w:rPr>
+        <w:t>Figura 5. Captura de la misma vista 3D tras arrastrar con el ratón. El cambio de perspectiva permite ver alturas y paredes sin alterar los datos de la corrida.</w:t>
       </w:r>
     </w:p>
     <w:tbl>
@@ -2369,112 +2581,6 @@
     </w:tbl>
     <w:p/>
     <w:p>
-      <w:pPr>
-        <w:keepNext/>
-        <w:jc w:val="center"/>
-      </w:pPr>
-      <w:r>
-        <w:drawing>
-          <wp:inline xmlns:a="http://schemas.openxmlformats.org/drawingml/2006/main" xmlns:pic="http://schemas.openxmlformats.org/drawingml/2006/picture">
-            <wp:extent cx="4297680" cy="3479074"/>
-            <wp:docPr id="2" name="Picture 2"/>
-            <wp:cNvGraphicFramePr>
-              <a:graphicFrameLocks noChangeAspect="1"/>
-            </wp:cNvGraphicFramePr>
-            <a:graphic>
-              <a:graphicData uri="http://schemas.openxmlformats.org/drawingml/2006/picture">
-                <pic:pic>
-                  <pic:nvPicPr>
-                    <pic:cNvPr id="0" name="point_cloud_3d.png"/>
-                    <pic:cNvPicPr/>
-                  </pic:nvPicPr>
-                  <pic:blipFill>
-                    <a:blip r:embed="rId10"/>
-                    <a:stretch>
-                      <a:fillRect/>
-                    </a:stretch>
-                  </pic:blipFill>
-                  <pic:spPr>
-                    <a:xfrm>
-                      <a:off x="0" y="0"/>
-                      <a:ext cx="4297680" cy="3479074"/>
-                    </a:xfrm>
-                    <a:prstGeom prst="rect"/>
-                  </pic:spPr>
-                </pic:pic>
-              </a:graphicData>
-            </a:graphic>
-          </wp:inline>
-        </w:drawing>
-      </w:r>
-    </w:p>
-    <w:p>
-      <w:pPr>
-        <w:spacing w:after="240"/>
-        <w:jc w:val="center"/>
-      </w:pPr>
-      <w:r>
-        <w:rPr>
-          <w:i/>
-          <w:sz w:val="18"/>
-        </w:rPr>
-        <w:t>Figura 2. Nube LiDAR 3D medida y ubicada con la pose planar estimada; color según altura z. Las curvas al nivel del suelo comparan la ruta verdadera y la estimada en EXP-0A04E1799939.</w:t>
-      </w:r>
-    </w:p>
-    <w:p>
-      <w:pPr>
-        <w:keepNext/>
-        <w:jc w:val="center"/>
-      </w:pPr>
-      <w:r>
-        <w:drawing>
-          <wp:inline xmlns:a="http://schemas.openxmlformats.org/drawingml/2006/main" xmlns:pic="http://schemas.openxmlformats.org/drawingml/2006/picture">
-            <wp:extent cx="5943600" cy="4829175"/>
-            <wp:docPr id="3" name="Picture 3"/>
-            <wp:cNvGraphicFramePr>
-              <a:graphicFrameLocks noChangeAspect="1"/>
-            </wp:cNvGraphicFramePr>
-            <a:graphic>
-              <a:graphicData uri="http://schemas.openxmlformats.org/drawingml/2006/picture">
-                <pic:pic>
-                  <pic:nvPicPr>
-                    <pic:cNvPr id="0" name="scene_3d.png"/>
-                    <pic:cNvPicPr/>
-                  </pic:nvPicPr>
-                  <pic:blipFill>
-                    <a:blip r:embed="rId11"/>
-                    <a:stretch>
-                      <a:fillRect/>
-                    </a:stretch>
-                  </pic:blipFill>
-                  <pic:spPr>
-                    <a:xfrm>
-                      <a:off x="0" y="0"/>
-                      <a:ext cx="5943600" cy="4829175"/>
-                    </a:xfrm>
-                    <a:prstGeom prst="rect"/>
-                  </pic:spPr>
-                </pic:pic>
-              </a:graphicData>
-            </a:graphic>
-          </wp:inline>
-        </w:drawing>
-      </w:r>
-    </w:p>
-    <w:p>
-      <w:pPr>
-        <w:spacing w:after="240"/>
-        <w:jc w:val="center"/>
-      </w:pPr>
-      <w:r>
-        <w:rPr>
-          <w:i/>
-          <w:sz w:val="18"/>
-        </w:rPr>
-        <w:t>Figura 3. Geometría extruida del mundo y trayectorias de la misma corrida EXP-0A04E1799939.</w:t>
-      </w:r>
-    </w:p>
-    <w:p>
       <w:r>
         <w:t>El F1 de pared 3D usa superficies estáticas como referencia y excluye retornos cercanos al suelo. Su recall baja cuando la trayectoria no observa todas las paredes. Las cifras describen esta configuración y esta semilla; no establecen la precisión general de otro algoritmo o entorno.</w:t>
       </w:r>
@@ -2546,6 +2652,59 @@
     </w:p>
     <w:p>
       <w:pPr>
+        <w:keepNext/>
+        <w:jc w:val="center"/>
+      </w:pPr>
+      <w:r>
+        <w:drawing>
+          <wp:inline xmlns:a="http://schemas.openxmlformats.org/drawingml/2006/main" xmlns:pic="http://schemas.openxmlformats.org/drawingml/2006/picture">
+            <wp:extent cx="5943600" cy="3820886"/>
+            <wp:docPr id="6" name="Picture 6"/>
+            <wp:cNvGraphicFramePr>
+              <a:graphicFrameLocks noChangeAspect="1"/>
+            </wp:cNvGraphicFramePr>
+            <a:graphic>
+              <a:graphicData uri="http://schemas.openxmlformats.org/drawingml/2006/picture">
+                <pic:pic>
+                  <pic:nvPicPr>
+                    <pic:cNvPr id="0" name="gui_batch.png"/>
+                    <pic:cNvPicPr/>
+                  </pic:nvPicPr>
+                  <pic:blipFill>
+                    <a:blip r:embed="rId14"/>
+                    <a:stretch>
+                      <a:fillRect/>
+                    </a:stretch>
+                  </pic:blipFill>
+                  <pic:spPr>
+                    <a:xfrm>
+                      <a:off x="0" y="0"/>
+                      <a:ext cx="5943600" cy="3820886"/>
+                    </a:xfrm>
+                    <a:prstGeom prst="rect"/>
+                  </pic:spPr>
+                </pic:pic>
+              </a:graphicData>
+            </a:graphic>
+          </wp:inline>
+        </w:drawing>
+      </w:r>
+    </w:p>
+    <w:p>
+      <w:pPr>
+        <w:spacing w:after="240"/>
+        <w:jc w:val="center"/>
+      </w:pPr>
+      <w:r>
+        <w:rPr>
+          <w:i/>
+          <w:sz w:val="18"/>
+        </w:rPr>
+        <w:t>Figura 6. Lotes después de pulsar Ejecutar lote. La selección visible usa dos semillas, un entorno y odometría de ruedas; la tabla presenta la media de cada métrica exportada.</w:t>
+      </w:r>
+    </w:p>
+    <w:p>
+      <w:pPr>
         <w:pStyle w:val="Heading2"/>
       </w:pPr>
       <w:r>
@@ -2613,6 +2772,59 @@
       </w:r>
     </w:p>
     <w:p>
+      <w:pPr>
+        <w:keepNext/>
+        <w:jc w:val="center"/>
+      </w:pPr>
+      <w:r>
+        <w:drawing>
+          <wp:inline xmlns:a="http://schemas.openxmlformats.org/drawingml/2006/main" xmlns:pic="http://schemas.openxmlformats.org/drawingml/2006/picture">
+            <wp:extent cx="5943600" cy="3820886"/>
+            <wp:docPr id="7" name="Picture 7"/>
+            <wp:cNvGraphicFramePr>
+              <a:graphicFrameLocks noChangeAspect="1"/>
+            </wp:cNvGraphicFramePr>
+            <a:graphic>
+              <a:graphicData uri="http://schemas.openxmlformats.org/drawingml/2006/picture">
+                <pic:pic>
+                  <pic:nvPicPr>
+                    <pic:cNvPr id="0" name="gui_asrf.png"/>
+                    <pic:cNvPicPr/>
+                  </pic:nvPicPr>
+                  <pic:blipFill>
+                    <a:blip r:embed="rId15"/>
+                    <a:stretch>
+                      <a:fillRect/>
+                    </a:stretch>
+                  </pic:blipFill>
+                  <pic:spPr>
+                    <a:xfrm>
+                      <a:off x="0" y="0"/>
+                      <a:ext cx="5943600" cy="3820886"/>
+                    </a:xfrm>
+                    <a:prstGeom prst="rect"/>
+                  </pic:spPr>
+                </pic:pic>
+              </a:graphicData>
+            </a:graphic>
+          </wp:inline>
+        </w:drawing>
+      </w:r>
+    </w:p>
+    <w:p>
+      <w:pPr>
+        <w:spacing w:after="240"/>
+        <w:jc w:val="center"/>
+      </w:pPr>
+      <w:r>
+        <w:rPr>
+          <w:i/>
+          <w:sz w:val="18"/>
+        </w:rPr>
+        <w:t>Figura 7. Robustez ASRF tras pulsar Estimar frontera ASRF. Los círculos marcan condiciones evaluadas; el color interpola un mapa exploratorio y no equivale a una probabilidad calibrada.</w:t>
+      </w:r>
+    </w:p>
+    <w:p>
       <w:r>
         <w:t>Para métricas de error como ATE, superar el umbral significa fallo; para F1, IoU, SRS o disponibilidad, caer por debajo del umbral significa fallo. Una región uniforme en el mapa no demuestra que se haya observado toda la transición. Si solo se muestrea una clase, cambie límites o umbral y repita con más semillas.</w:t>
       </w:r>
@@ -2636,11 +2848,6 @@
       </w:r>
     </w:p>
     <w:p>
-      <w:r>
-        <w:t>La siguiente figura proviene de ejecutar configs/example_occupancy_grid.yaml con semilla 42 e ICP. Su ID es EXP-21A8515979EB, su ATE RMSE es 0.009939 m, IoU de ocupado es 0.116943 y exactitud de libre observado 0.977435. La IoU relativamente baja incluye muros de salas que el robot no recorrió; no implica que toda celda libre observada sea errónea. El contador de contacto central con paredes fue cero.</w:t>
-      </w:r>
-    </w:p>
-    <w:p>
       <w:pPr>
         <w:keepNext/>
         <w:jc w:val="center"/>
@@ -2648,8 +2855,8 @@
       <w:r>
         <w:drawing>
           <wp:inline xmlns:a="http://schemas.openxmlformats.org/drawingml/2006/main" xmlns:pic="http://schemas.openxmlformats.org/drawingml/2006/picture">
-            <wp:extent cx="5303520" cy="4309110"/>
-            <wp:docPr id="4" name="Picture 4"/>
+            <wp:extent cx="5943600" cy="3820886"/>
+            <wp:docPr id="8" name="Picture 8"/>
             <wp:cNvGraphicFramePr>
               <a:graphicFrameLocks noChangeAspect="1"/>
             </wp:cNvGraphicFramePr>
@@ -2657,11 +2864,11 @@
               <a:graphicData uri="http://schemas.openxmlformats.org/drawingml/2006/picture">
                 <pic:pic>
                   <pic:nvPicPr>
-                    <pic:cNvPr id="0" name="occupancy_grid.png"/>
+                    <pic:cNvPr id="0" name="gui_dataset.png"/>
                     <pic:cNvPicPr/>
                   </pic:nvPicPr>
                   <pic:blipFill>
-                    <a:blip r:embed="rId12"/>
+                    <a:blip r:embed="rId16"/>
                     <a:stretch>
                       <a:fillRect/>
                     </a:stretch>
@@ -2669,7 +2876,7 @@
                   <pic:spPr>
                     <a:xfrm>
                       <a:off x="0" y="0"/>
-                      <a:ext cx="5303520" cy="4309110"/>
+                      <a:ext cx="5943600" cy="3820886"/>
                     </a:xfrm>
                     <a:prstGeom prst="rect"/>
                   </pic:spPr>
@@ -2690,7 +2897,65 @@
           <w:i/>
           <w:sz w:val="18"/>
         </w:rPr>
-        <w:t>Figura 4. Mapa de ocupación observado de EXP-21A8515979EB, celdas de 0.2 m, paredes estáticas de referencia y trayectorias. Las salas no observadas permanecen desconocidas.</w:t>
+        <w:t>Figura 8. Pestaña Dataset después de pulsar Generar dataset con cámara activada. La imagen es un cuadro RGB medido de la cámara esquemática; su aspecto pixelado corresponde a la baja resolución elegida para esta prueba.</w:t>
+      </w:r>
+    </w:p>
+    <w:p>
+      <w:r>
+        <w:t>La siguiente figura proviene de ejecutar configs/example_occupancy_grid.yaml con semilla 42 e ICP. Su ID es EXP-21A8515979EB, su ATE RMSE es 0.009939 m, IoU de ocupado es 0.116943 y exactitud de libre observado 0.977435. La IoU relativamente baja incluye muros de salas que el robot no recorrió; no implica que toda celda libre observada sea errónea. El contador de contacto central con paredes fue cero.</w:t>
+      </w:r>
+    </w:p>
+    <w:p>
+      <w:pPr>
+        <w:keepNext/>
+        <w:jc w:val="center"/>
+      </w:pPr>
+      <w:r>
+        <w:drawing>
+          <wp:inline xmlns:a="http://schemas.openxmlformats.org/drawingml/2006/main" xmlns:pic="http://schemas.openxmlformats.org/drawingml/2006/picture">
+            <wp:extent cx="5943600" cy="3820886"/>
+            <wp:docPr id="9" name="Picture 9"/>
+            <wp:cNvGraphicFramePr>
+              <a:graphicFrameLocks noChangeAspect="1"/>
+            </wp:cNvGraphicFramePr>
+            <a:graphic>
+              <a:graphicData uri="http://schemas.openxmlformats.org/drawingml/2006/picture">
+                <pic:pic>
+                  <pic:nvPicPr>
+                    <pic:cNvPr id="0" name="gui_occupancy.png"/>
+                    <pic:cNvPicPr/>
+                  </pic:nvPicPr>
+                  <pic:blipFill>
+                    <a:blip r:embed="rId17"/>
+                    <a:stretch>
+                      <a:fillRect/>
+                    </a:stretch>
+                  </pic:blipFill>
+                  <pic:spPr>
+                    <a:xfrm>
+                      <a:off x="0" y="0"/>
+                      <a:ext cx="5943600" cy="3820886"/>
+                    </a:xfrm>
+                    <a:prstGeom prst="rect"/>
+                  </pic:spPr>
+                </pic:pic>
+              </a:graphicData>
+            </a:graphic>
+          </wp:inline>
+        </w:drawing>
+      </w:r>
+    </w:p>
+    <w:p>
+      <w:pPr>
+        <w:spacing w:after="240"/>
+        <w:jc w:val="center"/>
+      </w:pPr>
+      <w:r>
+        <w:rPr>
+          <w:i/>
+          <w:sz w:val="18"/>
+        </w:rPr>
+        <w:t>Figura 9. Pestaña Ocupación 2D tras ejecutar el ejemplo de 0.2 m por celda. El azul indica libre observado, el naranja indica ocupado estimado y el fondo oscuro permanece sin observar. Las paredes grises sirven de referencia.</w:t>
       </w:r>
     </w:p>
     <w:p>

</xml_diff>